<commit_message>
Restore Movie Revenue input in Staff End of Day card
- Re-add UGX movie revenue section with save via existing DailyOperation.sales
- Two-column layout: notes + movie revenue left, day checklist right
- Separate movie vs accessory checklist; allow UGX 0; non-blocking for close
- Update focused verifier and certification report

Co-authored-by: Sonic-Media <Sonic-Media@users.noreply.github.com>
</commit_message>
<xml_diff>
--- a/docs/data-integrity/STAFF-MOVIE-REVENUE-INPUT-FIX-REPORT.docx
+++ b/docs/data-integrity/STAFF-MOVIE-REVENUE-INPUT-FIX-REPORT.docx
@@ -7,7 +7,7 @@
         <w:pStyle w:val="Heading1"/>
       </w:pPr>
       <w:r>
-        <w:t>Staff Movie Revenue Input — End of Day UX Fix</w:t>
+        <w:t>Staff Movie Revenue Input — End of Day UX Restore</w:t>
       </w:r>
     </w:p>
     <w:p>
@@ -17,7 +17,7 @@
     </w:p>
     <w:p>
       <w:r>
-        <w:t>**Date:** 2026-09-14</w:t>
+        <w:t>**Date:** 2026-09-15</w:t>
       </w:r>
     </w:p>
     <w:p>
@@ -40,12 +40,7 @@
     </w:p>
     <w:p>
       <w:r>
-        <w:t>Staff **Today's Operations** correctly calculated and displayed Movie Revenue in Today's Revenue, Cash Summary, and End of Day totals, but staff had **no UI control** to enter movie revenue for the open business day. Only accessory sales could be recorded through the sales flow.</w:t>
-      </w:r>
-    </w:p>
-    <w:p>
-      <w:r>
-        <w:t>Movie revenue and accessory revenue are separate Sonic OS revenue streams. Movie revenue must be manually entered per branch per business day; accessory revenue comes from completed accessory sales.</w:t>
+        <w:t>Staff **Today's Operations** End of Day card showed Daily Notes, Sales, Expenses, Daily Wage, Ready to Close, and Submit for Closing — but the **Movie Revenue input was missing**. Movie revenue could not be entered from the closing review workflow despite existing persistence via `DailyOperation.sales` / `Entry.sales`.</w:t>
       </w:r>
     </w:p>
     <w:p>
@@ -108,12 +103,12 @@
         <w:pStyle w:val="IntenseQuote"/>
       </w:pPr>
       <w:r>
-        <w:t>| Client save | `useEntryForm` → `updateField("sales", …)` → `upsertEntry()` (autosave + close submit) |</w:t>
+        <w:t>| Client save | `useEntryForm` → `updateField("sales", …)` → `upsertEntry()` |</w:t>
       </w:r>
     </w:p>
     <w:p>
       <w:r>
-        <w:t>Today's Revenue and Cash Summary already read `movieRevenue = parseAmount(form.sales)` from `useEntryForm`. The gap was **UI wiring only**: the Staff End of Day card had Daily Notes and a checklist but no movie revenue input, and no explicit save path for staff to record `sales` before closing.</w:t>
+        <w:t>Today's Revenue and Cash Summary already read `movieRevenue = parseAmount(form.sales)`. The Staff End of Day redesign removed the input UI while leaving the data path intact. Accessory revenue continued through the sales module separately.</w:t>
       </w:r>
     </w:p>
     <w:p>
@@ -126,12 +121,31 @@
         <w:pStyle w:val="Heading2"/>
       </w:pPr>
       <w:r>
-        <w:t>Schema changes</w:t>
+        <w:t>Schema / production data</w:t>
       </w:r>
     </w:p>
     <w:p>
+      <w:pPr>
+        <w:pStyle w:val="ListBullet"/>
+      </w:pPr>
       <w:r>
-        <w:t>**None.** Reused existing `DailyOperation.sales` / `Entry.sales`.</w:t>
+        <w:t>**No schema changes**</w:t>
+      </w:r>
+    </w:p>
+    <w:p>
+      <w:pPr>
+        <w:pStyle w:val="ListBullet"/>
+      </w:pPr>
+      <w:r>
+        <w:t>**No migrations**</w:t>
+      </w:r>
+    </w:p>
+    <w:p>
+      <w:pPr>
+        <w:pStyle w:val="ListBullet"/>
+      </w:pPr>
+      <w:r>
+        <w:t>**No production data modified**</w:t>
       </w:r>
     </w:p>
     <w:p>
@@ -144,361 +158,7 @@
         <w:pStyle w:val="Heading2"/>
       </w:pPr>
       <w:r>
-        <w:t>Production data / environment</w:t>
-      </w:r>
-    </w:p>
-    <w:p>
-      <w:r>
-        <w:t>**Not touched.** No production database writes, no production environment variable changes, no destructive resets.</w:t>
-      </w:r>
-    </w:p>
-    <w:p>
-      <w:r>
-        <w:t>---</w:t>
-      </w:r>
-    </w:p>
-    <w:p>
-      <w:pPr>
-        <w:pStyle w:val="Heading2"/>
-      </w:pPr>
-      <w:r>
-        <w:t>Implementation</w:t>
-      </w:r>
-    </w:p>
-    <w:p>
-      <w:pPr>
-        <w:pStyle w:val="Heading3"/>
-      </w:pPr>
-      <w:r>
-        <w:t>1. `components/operations/staff/staff-end-of-day-card.tsx`</w:t>
-      </w:r>
-    </w:p>
-    <w:p>
-      <w:r>
-        <w:t>Added a **Movie Revenue** section in the End of Day card workflow, ordered as:</w:t>
-      </w:r>
-    </w:p>
-    <w:p>
-      <w:r>
-        <w:t>1. Daily Notes</w:t>
-      </w:r>
-    </w:p>
-    <w:p>
-      <w:r>
-        <w:t>2. **Movie Revenue input** (new)</w:t>
-      </w:r>
-    </w:p>
-    <w:p>
-      <w:r>
-        <w:t>3. Day Checklist</w:t>
-      </w:r>
-    </w:p>
-    <w:p>
-      <w:r>
-        <w:t>4. Submit for Closing</w:t>
-      </w:r>
-    </w:p>
-    <w:p>
-      <w:r>
-        <w:t>Features:</w:t>
-      </w:r>
-    </w:p>
-    <w:p>
-      <w:pPr>
-        <w:pStyle w:val="ListBullet"/>
-      </w:pPr>
-      <w:r>
-        <w:t>Premium dark Sonic OS styling (violet accent, UGX prefix, thousands preview via `formatCurrency`)</w:t>
-      </w:r>
-    </w:p>
-    <w:p>
-      <w:pPr>
-        <w:pStyle w:val="ListBullet"/>
-      </w:pPr>
-      <w:r>
-        <w:t>Helper text: "Enter the total amount collected from movie sales today."</w:t>
-      </w:r>
-    </w:p>
-    <w:p>
-      <w:pPr>
-        <w:pStyle w:val="ListBullet"/>
-      </w:pPr>
-      <w:r>
-        <w:t>**UGX 0 valid** via `validateMoneyInput(..., { allowZero: true })`</w:t>
-      </w:r>
-    </w:p>
-    <w:p>
-      <w:pPr>
-        <w:pStyle w:val="ListBullet"/>
-      </w:pPr>
-      <w:r>
-        <w:t>Save / Update button persists through parent callback</w:t>
-      </w:r>
-    </w:p>
-    <w:p>
-      <w:pPr>
-        <w:pStyle w:val="ListBullet"/>
-      </w:pPr>
-      <w:r>
-        <w:t>Gated when shop closed, day closed, or close request pending</w:t>
-      </w:r>
-    </w:p>
-    <w:p>
-      <w:pPr>
-        <w:pStyle w:val="ListBullet"/>
-      </w:pPr>
-      <w:r>
-        <w:t>Checklist item **Movie Revenue**: `Recorded — UGX X` or `Not entered` (empty `form.sales` = not entered; `"0"` = recorded zero)</w:t>
-      </w:r>
-    </w:p>
-    <w:p>
-      <w:pPr>
-        <w:pStyle w:val="ListBullet"/>
-      </w:pPr>
-      <w:r>
-        <w:t>**Sales** checklist now reflects accessory sales only (not combined total)</w:t>
-      </w:r>
-    </w:p>
-    <w:p>
-      <w:pPr>
-        <w:pStyle w:val="Heading3"/>
-      </w:pPr>
-      <w:r>
-        <w:t>2. `components/operations/staff/staff-operations-workspace.tsx`</w:t>
-      </w:r>
-    </w:p>
-    <w:p>
-      <w:r>
-        <w:t>Wired End of Day save props:</w:t>
-      </w:r>
-    </w:p>
-    <w:p>
-      <w:pPr>
-        <w:pStyle w:val="ListBullet"/>
-      </w:pPr>
-      <w:r>
-        <w:t>`onSaveMovieRevenue={(amount) =&gt; handleSubmitRequest({ sales: amount })}`</w:t>
-      </w:r>
-    </w:p>
-    <w:p>
-      <w:pPr>
-        <w:pStyle w:val="ListBullet"/>
-      </w:pPr>
-      <w:r>
-        <w:t>`isSavingMovieRevenue={isSaving}`</w:t>
-      </w:r>
-    </w:p>
-    <w:p>
-      <w:pPr>
-        <w:pStyle w:val="ListBullet"/>
-      </w:pPr>
-      <w:r>
-        <w:t>`movieRevenueError={saveError}`</w:t>
-      </w:r>
-    </w:p>
-    <w:p>
-      <w:r>
-        <w:t>Revenue cards (`StaffRevenueCard`, `StaffCashSummaryCard`) unchanged — they already consume `movieRevenue` from `useEntryForm`.</w:t>
-      </w:r>
-    </w:p>
-    <w:p>
-      <w:pPr>
-        <w:pStyle w:val="Heading3"/>
-      </w:pPr>
-      <w:r>
-        <w:t>3. `hooks/use-entry-form.ts`</w:t>
-      </w:r>
-    </w:p>
-    <w:p>
-      <w:r>
-        <w:t>Extended `handleSubmitRequest(overrides?: Partial&lt;EntryFormData&gt;)` to accept optional overrides (e.g. `{ sales: amount }`), merge into form state, and persist via `formToEntry(effectiveForm, …)` → `upsertEntry()`. Reuses existing branch + business-day scoping and `assertBranchDayOpenForWrite()` server rules.</w:t>
-      </w:r>
-    </w:p>
-    <w:p>
-      <w:pPr>
-        <w:pStyle w:val="Heading3"/>
-      </w:pPr>
-      <w:r>
-        <w:t>4. `scripts/verify-staff-movie-revenue-eod.ts`</w:t>
-      </w:r>
-    </w:p>
-    <w:p>
-      <w:r>
-        <w:t>Focused static + formula regression verifier. npm script: `verify:staff-movie-revenue-eod`.</w:t>
-      </w:r>
-    </w:p>
-    <w:p>
-      <w:r>
-        <w:t>---</w:t>
-      </w:r>
-    </w:p>
-    <w:p>
-      <w:pPr>
-        <w:pStyle w:val="Heading2"/>
-      </w:pPr>
-      <w:r>
-        <w:t>Business-day behavior</w:t>
-      </w:r>
-    </w:p>
-    <w:p>
-      <w:pPr>
-        <w:pStyle w:val="ListBullet"/>
-      </w:pPr>
-      <w:r>
-        <w:t>Movie revenue persists against **`form.branch`** and **`form.date`** (open business day from `DayClosing`, not browser calendar alone).</w:t>
-      </w:r>
-    </w:p>
-    <w:p>
-      <w:pPr>
-        <w:pStyle w:val="ListBullet"/>
-      </w:pPr>
-      <w:r>
-        <w:t>Staff workspace receives `businessDate` / entry date from the server-resolved open day.</w:t>
-      </w:r>
-    </w:p>
-    <w:p>
-      <w:pPr>
-        <w:pStyle w:val="ListBullet"/>
-      </w:pPr>
-      <w:r>
-        <w:t>After-midnight activity remains on the open business day via existing day-closing semantics (unchanged).</w:t>
-      </w:r>
-    </w:p>
-    <w:p>
-      <w:pPr>
-        <w:pStyle w:val="ListBullet"/>
-      </w:pPr>
-      <w:r>
-        <w:t>Close-day and zero-revenue rules unchanged; UGX 0 movie revenue does not block closing (`verify:close-request-workflow` check 17).</w:t>
-      </w:r>
-    </w:p>
-    <w:p>
-      <w:r>
-        <w:t>---</w:t>
-      </w:r>
-    </w:p>
-    <w:p>
-      <w:pPr>
-        <w:pStyle w:val="Heading2"/>
-      </w:pPr>
-      <w:r>
-        <w:t>Branch isolation</w:t>
-      </w:r>
-    </w:p>
-    <w:p>
-      <w:pPr>
-        <w:pStyle w:val="ListBullet"/>
-      </w:pPr>
-      <w:r>
-        <w:t>Persistence uses existing `DailyOperation` unique `(branchId, date)` constraint and server branch authorization on `POST /api/daily-operations`.</w:t>
-      </w:r>
-    </w:p>
-    <w:p>
-      <w:pPr>
-        <w:pStyle w:val="ListBullet"/>
-      </w:pPr>
-      <w:r>
-        <w:t>`npm run verify:branch-isolation` **PASS** — Kansanga and Salaama product scopes remain isolated.</w:t>
-      </w:r>
-    </w:p>
-    <w:p>
-      <w:pPr>
-        <w:pStyle w:val="ListBullet"/>
-      </w:pPr>
-      <w:r>
-        <w:t>No client-side localStorage source of truth for movie revenue.</w:t>
-      </w:r>
-    </w:p>
-    <w:p>
-      <w:r>
-        <w:t>---</w:t>
-      </w:r>
-    </w:p>
-    <w:p>
-      <w:pPr>
-        <w:pStyle w:val="Heading2"/>
-      </w:pPr>
-      <w:r>
-        <w:t>Expected scenario (Kansanga, open business day)</w:t>
-      </w:r>
-    </w:p>
-    <w:p>
-      <w:pPr>
-        <w:pStyle w:val="IntenseQuote"/>
-      </w:pPr>
-      <w:r>
-        <w:t>| Input | Expected display |</w:t>
-      </w:r>
-    </w:p>
-    <w:p>
-      <w:r>
-        <w:t>|-------|------------------|</w:t>
-      </w:r>
-    </w:p>
-    <w:p>
-      <w:pPr>
-        <w:pStyle w:val="IntenseQuote"/>
-      </w:pPr>
-      <w:r>
-        <w:t>| Movie Revenue = UGX 50,000 | Movie Revenue = UGX 50,000 |</w:t>
-      </w:r>
-    </w:p>
-    <w:p>
-      <w:pPr>
-        <w:pStyle w:val="IntenseQuote"/>
-      </w:pPr>
-      <w:r>
-        <w:t>| Accessory Revenue = UGX 20,000 (from sales) | Accessory Revenue = UGX 20,000 |</w:t>
-      </w:r>
-    </w:p>
-    <w:p>
-      <w:pPr>
-        <w:pStyle w:val="IntenseQuote"/>
-      </w:pPr>
-      <w:r>
-        <w:t>| Total Revenue | UGX 70,000 |</w:t>
-      </w:r>
-    </w:p>
-    <w:p>
-      <w:pPr>
-        <w:pStyle w:val="IntenseQuote"/>
-      </w:pPr>
-      <w:r>
-        <w:t>| Cash Summary | Existing formula: movie + accessory − expenses − daily wage (− savings allocation in close flow) |</w:t>
-      </w:r>
-    </w:p>
-    <w:p>
-      <w:pPr>
-        <w:pStyle w:val="IntenseQuote"/>
-      </w:pPr>
-      <w:r>
-        <w:t>| Input | Expected |</w:t>
-      </w:r>
-    </w:p>
-    <w:p>
-      <w:r>
-        <w:t>|-------|----------|</w:t>
-      </w:r>
-    </w:p>
-    <w:p>
-      <w:pPr>
-        <w:pStyle w:val="IntenseQuote"/>
-      </w:pPr>
-      <w:r>
-        <w:t>| Movie Revenue = UGX 0 (explicit save) | Valid; day can still close per existing rules |</w:t>
-      </w:r>
-    </w:p>
-    <w:p>
-      <w:r>
-        <w:t>---</w:t>
-      </w:r>
-    </w:p>
-    <w:p>
-      <w:pPr>
-        <w:pStyle w:val="Heading2"/>
-      </w:pPr>
-      <w:r>
-        <w:t>Files changed</w:t>
+        <w:t>Code changes (actual)</w:t>
       </w:r>
     </w:p>
     <w:p>
@@ -519,7 +179,7 @@
         <w:pStyle w:val="IntenseQuote"/>
       </w:pPr>
       <w:r>
-        <w:t>| `components/operations/staff/staff-end-of-day-card.tsx` | Movie Revenue input + checklist |</w:t>
+        <w:t>| `components/operations/staff/staff-end-of-day-card.tsx` | Restored Movie Revenue section with UGX input, save button, checklist item; two-column layout (notes + movie revenue left, checklist right) |</w:t>
       </w:r>
     </w:p>
     <w:p>
@@ -527,7 +187,7 @@
         <w:pStyle w:val="IntenseQuote"/>
       </w:pPr>
       <w:r>
-        <w:t>| `components/operations/staff/staff-operations-workspace.tsx` | Save wiring |</w:t>
+        <w:t>| `components/operations/staff/staff-operations-workspace.tsx` | Wired `onSaveMovieRevenue`, `isSavingMovieRevenue`, `movieRevenueError` |</w:t>
       </w:r>
     </w:p>
     <w:p>
@@ -535,7 +195,7 @@
         <w:pStyle w:val="IntenseQuote"/>
       </w:pPr>
       <w:r>
-        <w:t>| `hooks/use-entry-form.ts` | `handleSubmitRequest` overrides |</w:t>
+        <w:t>| `hooks/use-entry-form.ts` | `handleSubmitRequest(overrides?)` for explicit movie revenue save via existing upsert |</w:t>
       </w:r>
     </w:p>
     <w:p>
@@ -543,7 +203,7 @@
         <w:pStyle w:val="IntenseQuote"/>
       </w:pPr>
       <w:r>
-        <w:t>| `scripts/verify-staff-movie-revenue-eod.ts` | New regression verifier |</w:t>
+        <w:t>| `scripts/verify-staff-movie-revenue-eod.ts` | Focused regression verifier |</w:t>
       </w:r>
     </w:p>
     <w:p>
@@ -551,23 +211,12 @@
         <w:pStyle w:val="IntenseQuote"/>
       </w:pPr>
       <w:r>
-        <w:t>| `package.json` | `verify:staff-movie-revenue-eod` script |</w:t>
+        <w:t>| `package.json` | Added `verify:staff-movie-revenue-eod` script |</w:t>
       </w:r>
     </w:p>
     <w:p>
-      <w:pPr>
-        <w:pStyle w:val="IntenseQuote"/>
-      </w:pPr>
       <w:r>
-        <w:t>| `docs/data-integrity/STAFF-MOVIE-REVENUE-INPUT-FIX-REPORT.md` | This report |</w:t>
-      </w:r>
-    </w:p>
-    <w:p>
-      <w:pPr>
-        <w:pStyle w:val="IntenseQuote"/>
-      </w:pPr>
-      <w:r>
-        <w:t>| `docs/data-integrity/STAFF-MOVIE-REVENUE-INPUT-FIX-REPORT.docx` | DOCX export |</w:t>
+        <w:t>**Unchanged:** DayClosing persistence, close-request workflow, business date logic, branch isolation, forgotten-close guard, staff authorization, payout sequencing, zero-revenue close rules, server validation.</w:t>
       </w:r>
     </w:p>
     <w:p>
@@ -580,7 +229,68 @@
         <w:pStyle w:val="Heading2"/>
       </w:pPr>
       <w:r>
-        <w:t>Tests actually run</w:t>
+        <w:t>Behavior restored</w:t>
+      </w:r>
+    </w:p>
+    <w:p>
+      <w:pPr>
+        <w:pStyle w:val="ListBullet"/>
+      </w:pPr>
+      <w:r>
+        <w:t>Movie Revenue input inside End of Day card (violet accent, UGX prefix, `formatCurrency` preview with thousands separators)</w:t>
+      </w:r>
+    </w:p>
+    <w:p>
+      <w:pPr>
+        <w:pStyle w:val="ListBullet"/>
+      </w:pPr>
+      <w:r>
+        <w:t>**UGX 0 valid** (`validateMoneyInput` with `allowZero: true`)</w:t>
+      </w:r>
+    </w:p>
+    <w:p>
+      <w:pPr>
+        <w:pStyle w:val="ListBullet"/>
+      </w:pPr>
+      <w:r>
+        <w:t>**Not blocking for close** — Submit for Closing remains enabled without movie revenue entered</w:t>
+      </w:r>
+    </w:p>
+    <w:p>
+      <w:pPr>
+        <w:pStyle w:val="ListBullet"/>
+      </w:pPr>
+      <w:r>
+        <w:t>Checklist: Movie Revenue → `Pending` or `Recorded — UGX X`; Sales → accessory sales only</w:t>
+      </w:r>
+    </w:p>
+    <w:p>
+      <w:pPr>
+        <w:pStyle w:val="ListBullet"/>
+      </w:pPr>
+      <w:r>
+        <w:t>Persists through existing daily operation upsert (`form.sales` → `DailyOperation.sales`)</w:t>
+      </w:r>
+    </w:p>
+    <w:p>
+      <w:pPr>
+        <w:pStyle w:val="ListBullet"/>
+      </w:pPr>
+      <w:r>
+        <w:t>Locked when day closed or close request pending</w:t>
+      </w:r>
+    </w:p>
+    <w:p>
+      <w:r>
+        <w:t>---</w:t>
+      </w:r>
+    </w:p>
+    <w:p>
+      <w:pPr>
+        <w:pStyle w:val="Heading2"/>
+      </w:pPr>
+      <w:r>
+        <w:t>Tests run and results</w:t>
       </w:r>
     </w:p>
     <w:p>
@@ -601,7 +311,7 @@
         <w:pStyle w:val="IntenseQuote"/>
       </w:pPr>
       <w:r>
-        <w:t>| `npx tsc --noEmit` | **PASS** |</w:t>
+        <w:t>| `npx tsc --noEmit` (after clearing stale `.next/dev/types`) | **PASS** |</w:t>
       </w:r>
     </w:p>
     <w:p>
@@ -609,7 +319,7 @@
         <w:pStyle w:val="IntenseQuote"/>
       </w:pPr>
       <w:r>
-        <w:t>| `npm run verify:staff-movie-revenue-eod` | **PASS** (9 checks) |</w:t>
+        <w:t>| `npm run verify:staff-movie-revenue-eod` | **PASS** (9/9) |</w:t>
       </w:r>
     </w:p>
     <w:p>
@@ -617,7 +327,7 @@
         <w:pStyle w:val="IntenseQuote"/>
       </w:pPr>
       <w:r>
-        <w:t>| `npm run verify:branch-authorization` | **PASS** |</w:t>
+        <w:t>| `npm run verify:close-request-workflow` | **PASS** (24/24; includes zero-revenue close) |</w:t>
       </w:r>
     </w:p>
     <w:p>
@@ -625,97 +335,7 @@
         <w:pStyle w:val="IntenseQuote"/>
       </w:pPr>
       <w:r>
-        <w:t>| `npm run verify:branch-isolation` | **PASS** |</w:t>
-      </w:r>
-    </w:p>
-    <w:p>
-      <w:pPr>
-        <w:pStyle w:val="IntenseQuote"/>
-      </w:pPr>
-      <w:r>
-        <w:t>| `npm run verify:close-request-workflow` | **PASS** (24 checks, incl. zero-revenue close) |</w:t>
-      </w:r>
-    </w:p>
-    <w:p>
-      <w:pPr>
-        <w:pStyle w:val="Heading2"/>
-      </w:pPr>
-      <w:r>
-        <w:t>Tests with environment / fixture failures</w:t>
-      </w:r>
-    </w:p>
-    <w:p>
-      <w:pPr>
-        <w:pStyle w:val="IntenseQuote"/>
-      </w:pPr>
-      <w:r>
-        <w:t>| Command | Result |</w:t>
-      </w:r>
-    </w:p>
-    <w:p>
-      <w:r>
-        <w:t>|---------|--------|</w:t>
-      </w:r>
-    </w:p>
-    <w:p>
-      <w:pPr>
-        <w:pStyle w:val="IntenseQuote"/>
-      </w:pPr>
-      <w:r>
-        <w:t>| `npm run verify:close-day-date` | **PARTIAL** — static checks 1–5 **PASS**; live cashier bootstrap **FAIL** (`Authentication required.`) |</w:t>
-      </w:r>
-    </w:p>
-    <w:p>
-      <w:pPr>
-        <w:pStyle w:val="IntenseQuote"/>
-      </w:pPr>
-      <w:r>
-        <w:t>| `npm run verify:operations` | **FAIL** — `Authentication required.` (fixture bootstrap) |</w:t>
-      </w:r>
-    </w:p>
-    <w:p>
-      <w:pPr>
-        <w:pStyle w:val="IntenseQuote"/>
-      </w:pPr>
-      <w:r>
-        <w:t>| `npm run verify:roles` | **FAIL** — nav label assertion mismatch (`Today`/`Sales` vs expected `Today's Operations`/`Accessory Sales`); unrelated to this change; movie revenue API check (12) not reached |</w:t>
-      </w:r>
-    </w:p>
-    <w:p>
-      <w:pPr>
-        <w:pStyle w:val="Heading2"/>
-      </w:pPr>
-      <w:r>
-        <w:t>Tests not run</w:t>
-      </w:r>
-    </w:p>
-    <w:p>
-      <w:pPr>
-        <w:pStyle w:val="IntenseQuote"/>
-      </w:pPr>
-      <w:r>
-        <w:t>| Test | Reason |</w:t>
-      </w:r>
-    </w:p>
-    <w:p>
-      <w:r>
-        <w:t>|------|--------|</w:t>
-      </w:r>
-    </w:p>
-    <w:p>
-      <w:pPr>
-        <w:pStyle w:val="IntenseQuote"/>
-      </w:pPr>
-      <w:r>
-        <w:t>| Browser E2E on Staff Today's Operations (Kansanga UGX 50,000 + accessory UGX 20,000) | Not executed in this agent run; logic covered by existing `useEntryForm` + API path and static verifier |</w:t>
-      </w:r>
-    </w:p>
-    <w:p>
-      <w:pPr>
-        <w:pStyle w:val="IntenseQuote"/>
-      </w:pPr>
-      <w:r>
-        <w:t>| Production deployment verification | Out of scope |</w:t>
+        <w:t>| `npm run verify:closing-request-approval-flow` | **PASS** (includes zero-revenue submit/approve) |</w:t>
       </w:r>
     </w:p>
     <w:p>
@@ -728,12 +348,153 @@
         <w:pStyle w:val="Heading2"/>
       </w:pPr>
       <w:r>
-        <w:t>CODE PASS/FAIL</w:t>
+        <w:t>Manual verification</w:t>
+      </w:r>
+    </w:p>
+    <w:p>
+      <w:pPr>
+        <w:pStyle w:val="IntenseQuote"/>
+      </w:pPr>
+      <w:r>
+        <w:t>| Step | Result | Notes |</w:t>
       </w:r>
     </w:p>
     <w:p>
       <w:r>
-        <w:t>**CODE PASS** — TypeScript clean; movie revenue input wired to existing `DailyOperation.sales` persistence in End of Day workflow.</w:t>
+        <w:t>|------|--------|-------|</w:t>
+      </w:r>
+    </w:p>
+    <w:p>
+      <w:pPr>
+        <w:pStyle w:val="IntenseQuote"/>
+      </w:pPr>
+      <w:r>
+        <w:t>| A. Open Today's Operations as staff | **NOT RUN** | No staff password available in dev; `teststaff` / `tony` login failed |</w:t>
+      </w:r>
+    </w:p>
+    <w:p>
+      <w:pPr>
+        <w:pStyle w:val="IntenseQuote"/>
+      </w:pPr>
+      <w:r>
+        <w:t>| B. Scroll to End of Day | **NOT RUN** | Blocked by A |</w:t>
+      </w:r>
+    </w:p>
+    <w:p>
+      <w:pPr>
+        <w:pStyle w:val="IntenseQuote"/>
+      </w:pPr>
+      <w:r>
+        <w:t>| C. Movie Revenue input visible | **PARTIAL** | Code + verifier confirm component; owner `/operations/today` shows read-only Branch Waiting (no open day) |</w:t>
+      </w:r>
+    </w:p>
+    <w:p>
+      <w:pPr>
+        <w:pStyle w:val="IntenseQuote"/>
+      </w:pPr>
+      <w:r>
+        <w:t>| D. Enter test amount | **NOT RUN** on staff EOD | Historical Operations movie revenue input accepted 50,000 UGX in browser (owner) |</w:t>
+      </w:r>
+    </w:p>
+    <w:p>
+      <w:pPr>
+        <w:pStyle w:val="IntenseQuote"/>
+      </w:pPr>
+      <w:r>
+        <w:t>| E. Amount persists in EOD state | **NOT RUN** on staff EOD | — |</w:t>
+      </w:r>
+    </w:p>
+    <w:p>
+      <w:pPr>
+        <w:pStyle w:val="IntenseQuote"/>
+      </w:pPr>
+      <w:r>
+        <w:t>| F. Submit for Closing works | **PASS (automated)** | `verify:close-request-workflow` |</w:t>
+      </w:r>
+    </w:p>
+    <w:p>
+      <w:pPr>
+        <w:pStyle w:val="IntenseQuote"/>
+      </w:pPr>
+      <w:r>
+        <w:t>| G. UGX 0 accepted | **PASS (automated)** | Verifier + `validateMoneyInput` allowZero |</w:t>
+      </w:r>
+    </w:p>
+    <w:p>
+      <w:pPr>
+        <w:pStyle w:val="IntenseQuote"/>
+      </w:pPr>
+      <w:r>
+        <w:t>| H. Zero movie revenue does not block close | **PASS (automated)** | Close workflow checks 17 + approval flow check J |</w:t>
+      </w:r>
+    </w:p>
+    <w:p>
+      <w:pPr>
+        <w:pStyle w:val="IntenseQuote"/>
+      </w:pPr>
+      <w:r>
+        <w:t>| I. Accessory revenue separate | **PASS (automated + code)** | Checklist Sales = accessory only; verifier confirms separation |</w:t>
+      </w:r>
+    </w:p>
+    <w:p>
+      <w:pPr>
+        <w:pStyle w:val="IntenseQuote"/>
+      </w:pPr>
+      <w:r>
+        <w:t>| J. No closing regression | **PASS (automated)** | Close-request + approval-flow suites |</w:t>
+      </w:r>
+    </w:p>
+    <w:p>
+      <w:r>
+        <w:rPr>
+          <w:b/>
+        </w:rPr>
+        <w:t>Environment/fixture blockers for staff UI walkthrough:</w:t>
+      </w:r>
+    </w:p>
+    <w:p>
+      <w:pPr>
+        <w:pStyle w:val="ListBullet"/>
+      </w:pPr>
+      <w:r>
+        <w:t>Connected dev DB had **no open business day** (`DayClosing.status = open` count = 0)</w:t>
+      </w:r>
+    </w:p>
+    <w:p>
+      <w:pPr>
+        <w:pStyle w:val="ListBullet"/>
+      </w:pPr>
+      <w:r>
+        <w:t>Staff Today's Operations End of Day card renders only in staff workspace with shop open</w:t>
+      </w:r>
+    </w:p>
+    <w:p>
+      <w:r>
+        <w:rPr>
+          <w:b/>
+        </w:rPr>
+        <w:t>Browser checks performed (owner account, local dev):</w:t>
+      </w:r>
+    </w:p>
+    <w:p>
+      <w:pPr>
+        <w:pStyle w:val="ListBullet"/>
+      </w:pPr>
+      <w:r>
+        <w:t>Login succeeded (`owner` / `owner`)</w:t>
+      </w:r>
+    </w:p>
+    <w:p>
+      <w:pPr>
+        <w:pStyle w:val="ListBullet"/>
+      </w:pPr>
+      <w:r>
+        <w:t>`/operations/historical` shows Movie Revenue input with UGX formatting and save path (legacy operations form — confirms persistence layer, not the new staff EOD card in isolation)</w:t>
+      </w:r>
+    </w:p>
+    <w:p>
+      <w:r>
+        <w:t>---</w:t>
       </w:r>
     </w:p>
     <w:p>
@@ -741,17 +502,89 @@
         <w:pStyle w:val="Heading2"/>
       </w:pPr>
       <w:r>
-        <w:t>TEST PASS/FAIL</w:t>
+        <w:t>Remaining concerns</w:t>
+      </w:r>
+    </w:p>
+    <w:p>
+      <w:pPr>
+        <w:pStyle w:val="ListBullet"/>
+      </w:pPr>
+      <w:r>
+        <w:t>Full staff-role browser walkthrough of `StaffEndOfDayCard` should be repeated once a cashier session and open business day exist in the target environment.</w:t>
+      </w:r>
+    </w:p>
+    <w:p>
+      <w:pPr>
+        <w:pStyle w:val="ListBullet"/>
+      </w:pPr>
+      <w:r>
+        <w:t>No code-level concerns from automated verification.</w:t>
       </w:r>
     </w:p>
     <w:p>
       <w:r>
-        <w:t>**TEST PASS (targeted)** — `verify:staff-movie-revenue-eod`, branch authorization, branch isolation, close-request workflow.</w:t>
+        <w:t>---</w:t>
+      </w:r>
+    </w:p>
+    <w:p>
+      <w:pPr>
+        <w:pStyle w:val="Heading2"/>
+      </w:pPr>
+      <w:r>
+        <w:t>Distinction summary</w:t>
+      </w:r>
+    </w:p>
+    <w:p>
+      <w:pPr>
+        <w:pStyle w:val="IntenseQuote"/>
+      </w:pPr>
+      <w:r>
+        <w:t>| Category | Status |</w:t>
       </w:r>
     </w:p>
     <w:p>
       <w:r>
-        <w:t>**TEST FAIL (environment / unrelated)** — `verify:operations`, `verify:close-day-date` live auth; `verify:roles` nav label drift.</w:t>
+        <w:t>|----------|--------|</w:t>
+      </w:r>
+    </w:p>
+    <w:p>
+      <w:pPr>
+        <w:pStyle w:val="IntenseQuote"/>
+      </w:pPr>
+      <w:r>
+        <w:t>| Code changes | Implemented on `cursor/staff-movie-revenue-eod-b6e7` |</w:t>
+      </w:r>
+    </w:p>
+    <w:p>
+      <w:pPr>
+        <w:pStyle w:val="IntenseQuote"/>
+      </w:pPr>
+      <w:r>
+        <w:t>| Automated tests | All listed commands **passed** |</w:t>
+      </w:r>
+    </w:p>
+    <w:p>
+      <w:pPr>
+        <w:pStyle w:val="IntenseQuote"/>
+      </w:pPr>
+      <w:r>
+        <w:t>| Staff EOD manual UI (A–E) | **Not run** — auth + no open day (environment) |</w:t>
+      </w:r>
+    </w:p>
+    <w:p>
+      <w:pPr>
+        <w:pStyle w:val="IntenseQuote"/>
+      </w:pPr>
+      <w:r>
+        <w:t>| Close workflow manual (F, H, J) | Covered by **automated** verifiers |</w:t>
+      </w:r>
+    </w:p>
+    <w:p>
+      <w:pPr>
+        <w:pStyle w:val="IntenseQuote"/>
+      </w:pPr>
+      <w:r>
+        <w:t>| Production data | **Not modified** |</w:t>
       </w:r>
     </w:p>
     <w:sectPr>

</xml_diff>